<commit_message>
fix: regenerate readable interview summary doc
</commit_message>
<xml_diff>
--- a/docs/agent-interview-summary.docx
+++ b/docs/agent-interview-summary.docx
@@ -8,11 +8,12 @@
       </w:pPr>
       <w:r>
         <w:rPr>
+          <w:rFonts w:ascii="Microsoft YaHei" w:hAnsi="Microsoft YaHei" w:eastAsia="Microsoft YaHei"/>
           <w:b/>
           <w:color w:val="1F4E79"/>
           <w:sz w:val="40"/>
         </w:rPr>
-        <w:t>Python CLI Agent ???????</w:t>
+        <w:t>Python CLI Agent 项目面试讲解稿</w:t>
       </w:r>
     </w:p>
     <w:p>
@@ -21,20 +22,22 @@
       </w:pPr>
       <w:r>
         <w:rPr>
+          <w:rFonts w:ascii="Microsoft YaHei" w:hAnsi="Microsoft YaHei" w:eastAsia="Microsoft YaHei"/>
           <w:i/>
         </w:rPr>
-        <w:t>?????????????????????????????????</w:t>
+        <w:t>用于向面试官讲清楚项目定位、架构设计、安全策略、功能进展和工程质量</w:t>
       </w:r>
     </w:p>
     <w:p>
       <w:r>
         <w:rPr>
+          <w:rFonts w:ascii="Microsoft YaHei" w:hAnsi="Microsoft YaHei" w:eastAsia="Microsoft YaHei"/>
           <w:b/>
         </w:rPr>
-        <w:t>??????</w:t>
+        <w:t>项目一句话：</w:t>
       </w:r>
       <w:r>
-        <w:t>??????????? Python CLI Agent ?????????????? API???? Agent ????????????????????????????????????Hook ?????????????????????</w:t>
+        <w:t>这是一个从零实现的本地 Python CLI Agent 核心。重点不是简单调用大模型 API，而是把 Agent 运行时的结构化协议、工具执行、安全边界、审批策略、日志审计、技能、记忆、Hook 和文档读取能力做成可测试、可扩展的小内核。</w:t>
       </w:r>
     </w:p>
     <w:p>
@@ -42,7 +45,7 @@
         <w:pStyle w:val="Heading1"/>
       </w:pPr>
       <w:r>
-        <w:t>1. ????</w:t>
+        <w:t>1. 项目定位</w:t>
       </w:r>
     </w:p>
     <w:p>
@@ -50,7 +53,7 @@
         <w:pStyle w:val="ListBullet"/>
       </w:pPr>
       <w:r>
-        <w:t>????????????????????????????????????????????</w:t>
+        <w:t>目标用户：需要在本地代码仓库里执行开发、检查、文件读写、命令运行和文档研究任务的开发者。</w:t>
       </w:r>
     </w:p>
     <w:p>
@@ -58,7 +61,7 @@
         <w:pStyle w:val="ListBullet"/>
       </w:pPr>
       <w:r>
-        <w:t>???????????????????????? action ???? Agent Core ????????????</w:t>
+        <w:t>核心价值：模型不能直接操作系统资源，必须通过受控 action 协议，由 Agent Core 校验、授权、执行、记录。</w:t>
       </w:r>
     </w:p>
     <w:p>
@@ -66,18 +69,15 @@
         <w:pStyle w:val="ListBullet"/>
       </w:pPr>
       <w:r>
-        <w:t>???????????????????????????????????</w:t>
+        <w:t>设计重点：安全可控、输出有界、失败可恢复、日志可审计、后续能力可插拔。</w:t>
       </w:r>
     </w:p>
     <w:p>
+      <w:pPr>
+        <w:pStyle w:val="ListBullet"/>
+      </w:pPr>
       <w:r>
-        <w:rPr>
-          <w:b/>
-        </w:rPr>
-        <w:t>????????</w:t>
-      </w:r>
-      <w:r>
-        <w:t>???????? Agent ???????? prompt demo????????????????????????</w:t>
+        <w:t>面试重点：这个项目展示的是 Agent 工程能力，而不是 prompt demo。真正难点在于模型不可信时如何设计运行时边界。</w:t>
       </w:r>
     </w:p>
     <w:p>
@@ -85,7 +85,7 @@
         <w:pStyle w:val="Heading1"/>
       </w:pPr>
       <w:r>
-        <w:t>2. ??????</w:t>
+        <w:t>2. 当前版本进展</w:t>
       </w:r>
     </w:p>
     <w:tbl>
@@ -110,7 +110,7 @@
           </w:tcPr>
           <w:p>
             <w:r>
-              <w:t>??</w:t>
+              <w:t>版本</w:t>
             </w:r>
           </w:p>
         </w:tc>
@@ -122,7 +122,7 @@
           </w:tcPr>
           <w:p>
             <w:r>
-              <w:t>??</w:t>
+              <w:t>主题</w:t>
             </w:r>
           </w:p>
         </w:tc>
@@ -134,7 +134,7 @@
           </w:tcPr>
           <w:p>
             <w:r>
-              <w:t>?????</w:t>
+              <w:t>已完成能力</w:t>
             </w:r>
           </w:p>
         </w:tc>
@@ -146,7 +146,7 @@
           </w:tcPr>
           <w:p>
             <w:r>
-              <w:t>????</w:t>
+              <w:t>面试讲法</w:t>
             </w:r>
           </w:p>
         </w:tc>
@@ -170,7 +170,7 @@
           </w:tcPr>
           <w:p>
             <w:r>
-              <w:t>????</w:t>
+              <w:t>安全核心</w:t>
             </w:r>
           </w:p>
         </w:tc>
@@ -181,7 +181,7 @@
           </w:tcPr>
           <w:p>
             <w:r>
-              <w:t>fake LLM run loop???? action/observation?workspace sandbox?approval fail-fast?dry-run???????snapshot?CLI ???</w:t>
+              <w:t>fake LLM run loop、结构化 action/observation、workspace sandbox、approval fail-fast、dry-run、日志、脱敏、snapshot、CLI 诊断。</w:t>
             </w:r>
           </w:p>
         </w:tc>
@@ -192,7 +192,7 @@
           </w:tcPr>
           <w:p>
             <w:r>
-              <w:t>?? Agent ?????????????Core ????????</w:t>
+              <w:t>先把 Agent 内核做可信：模型只提请求，Core 负责验证和执行。</w:t>
             </w:r>
           </w:p>
         </w:tc>
@@ -216,7 +216,7 @@
           </w:tcPr>
           <w:p>
             <w:r>
-              <w:t>????</w:t>
+              <w:t>扩展能力</w:t>
             </w:r>
           </w:p>
         </w:tc>
@@ -227,7 +227,7 @@
           </w:tcPr>
           <w:p>
             <w:r>
-              <w:t>DeepSeek provider?skills?memory?disabled-by-default hooks????????/?? CLI?</w:t>
+              <w:t>DeepSeek provider、skills、memory、disabled-by-default hooks、配置诊断、技能/记忆 CLI。</w:t>
             </w:r>
           </w:p>
         </w:tc>
@@ -238,7 +238,7 @@
           </w:tcPr>
           <w:p>
             <w:r>
-              <w:t>??????????????????????</w:t>
+              <w:t>在安全内核上加扩展点，但扩展点不能绕过策略。</w:t>
             </w:r>
           </w:p>
         </w:tc>
@@ -262,7 +262,7 @@
           </w:tcPr>
           <w:p>
             <w:r>
-              <w:t>??????</w:t>
+              <w:t>文档能力起步</w:t>
             </w:r>
           </w:p>
         </w:tc>
@@ -273,7 +273,7 @@
           </w:tcPr>
           <w:p>
             <w:r>
-              <w:t>??? read_pdf?pypdf ???sandbox ????????????????</w:t>
+              <w:t>已实现 read_pdf：pypdf 提取、sandbox 校验、预算截断、不可信文档标记。</w:t>
             </w:r>
           </w:p>
         </w:tc>
@@ -284,7 +284,7 @@
           </w:tcPr>
           <w:p>
             <w:r>
-              <w:t>??????? source material????????????</w:t>
+              <w:t>文档内容只作为 source material，不能反向改写系统策略。</w:t>
             </w:r>
           </w:p>
         </w:tc>
@@ -295,7 +295,7 @@
         <w:pStyle w:val="Heading1"/>
       </w:pPr>
       <w:r>
-        <w:t>3. ?????</w:t>
+        <w:t>3. 架构主链路</w:t>
       </w:r>
     </w:p>
     <w:p>
@@ -303,7 +303,7 @@
         <w:pStyle w:val="ListBullet"/>
       </w:pPr>
       <w:r>
-        <w:t>CLI Layer???????? agent run?agent doctor?agent tools list?agent runs show?</w:t>
+        <w:t>CLI Layer：解析 agent run、agent doctor、agent tools list、agent runs show 等命令。</w:t>
       </w:r>
     </w:p>
     <w:p>
@@ -311,7 +311,7 @@
         <w:pStyle w:val="ListBullet"/>
       </w:pPr>
       <w:r>
-        <w:t>Config Layer???????????? CLI ??????????????????</w:t>
+        <w:t>Config Layer：合并默认、全局、项目和 CLI 配置，同时阻止项目配置降低安全边界。</w:t>
       </w:r>
     </w:p>
     <w:p>
@@ -319,7 +319,7 @@
         <w:pStyle w:val="ListBullet"/>
       </w:pPr>
       <w:r>
-        <w:t>Agent Core??? RunContext??? AGENTS.md?skills?memory?????? LLM?</w:t>
+        <w:t>Agent Core：创建 RunContext，组装 AGENTS.md、skills、memory，上下文进入 LLM。</w:t>
       </w:r>
     </w:p>
     <w:p>
@@ -327,7 +327,7 @@
         <w:pStyle w:val="ListBullet"/>
       </w:pPr>
       <w:r>
-        <w:t>LLM Layer??? LLMClient ??????? fake ? DeepSeek?Provider ????????????</w:t>
+        <w:t>LLM Layer：统一 LLMClient 接口，当前支持 fake 和 DeepSeek。</w:t>
       </w:r>
     </w:p>
     <w:p>
@@ -335,7 +335,7 @@
         <w:pStyle w:val="ListBullet"/>
       </w:pPr>
       <w:r>
-        <w:t>Action Protocol????? JSON action?Core ? Pydantic schema ?????? run_id?action_id?created_at?</w:t>
+        <w:t>Action Protocol：模型返回 JSON action，Core 用 Pydantic schema 校验，并注入 run_id、action_id、created_at。</w:t>
       </w:r>
     </w:p>
     <w:p>
@@ -343,7 +343,7 @@
         <w:pStyle w:val="ListBullet"/>
       </w:pPr>
       <w:r>
-        <w:t>Policy + Sandbox???? action ???? resolve ?????? workspace ??</w:t>
+        <w:t>Policy + Sandbox：先判断 action 风险，再 resolve 路径并限制在 workspace 内。</w:t>
       </w:r>
     </w:p>
     <w:p>
@@ -351,7 +351,7 @@
         <w:pStyle w:val="ListBullet"/>
       </w:pPr>
       <w:r>
-        <w:t>Tool Layer??????shell?git?document ??????? observation?</w:t>
+        <w:t>Tool Layer：执行文件、shell、git、document 工具，返回标准 observation。</w:t>
       </w:r>
     </w:p>
     <w:p>
@@ -359,7 +359,7 @@
         <w:pStyle w:val="ListBullet"/>
       </w:pPr>
       <w:r>
-        <w:t>Logging Layer?? tool_calls.jsonl ? summary.md?????????</w:t>
+        <w:t>Logging Layer：写 tool_calls.jsonl 和 summary.md，持久化前做脱敏。</w:t>
       </w:r>
     </w:p>
     <w:p>
@@ -368,7 +368,7 @@
           <w:rFonts w:ascii="Consolas" w:hAnsi="Consolas" w:eastAsia="Consolas"/>
           <w:sz w:val="18"/>
         </w:rPr>
-        <w:t>???? -&gt; CLI -&gt; Config -&gt; RunContext -&gt; PromptBuilder -&gt; LLM -&gt; ActionParser -&gt; Policy/Sandbox -&gt; ToolExecutor -&gt; Observation -&gt; Log/Summary</w:t>
+        <w:t>用户命令 -&gt; CLI -&gt; Config -&gt; RunContext -&gt; PromptBuilder -&gt; LLM -&gt; ActionParser -&gt; Policy/Sandbox -&gt; ToolExecutor -&gt; Observation -&gt; Log/Summary</w:t>
       </w:r>
     </w:p>
     <w:p>
@@ -376,7 +376,7 @@
         <w:pStyle w:val="Heading1"/>
       </w:pPr>
       <w:r>
-        <w:t>4. ??????</w:t>
+        <w:t>4. 核心功能清单</w:t>
       </w:r>
     </w:p>
     <w:p>
@@ -384,7 +384,7 @@
         <w:pStyle w:val="Heading2"/>
       </w:pPr>
       <w:r>
-        <w:t>4.1 CLI ?????</w:t>
+        <w:t>4.1 CLI 与运行管理</w:t>
       </w:r>
     </w:p>
     <w:p>
@@ -392,7 +392,7 @@
         <w:pStyle w:val="ListBullet"/>
       </w:pPr>
       <w:r>
-        <w:t>agent run "inspect project"????? agent ???</w:t>
+        <w:t>agent run "inspect project"：执行一次 agent 任务。</w:t>
       </w:r>
     </w:p>
     <w:p>
@@ -400,7 +400,7 @@
         <w:pStyle w:val="ListBullet"/>
       </w:pPr>
       <w:r>
-        <w:t>agent doctor / agent config doctor??? Python?rg????provider?API key ?????</w:t>
+        <w:t>agent doctor / agent config doctor：检查 Python、rg、配置、provider、API key 环境变量。</w:t>
       </w:r>
     </w:p>
     <w:p>
@@ -408,7 +408,7 @@
         <w:pStyle w:val="ListBullet"/>
       </w:pPr>
       <w:r>
-        <w:t>agent tools list???????????dry-run ???</w:t>
+        <w:t>agent tools list：展示工具、风险类别、dry-run 行为。</w:t>
       </w:r>
     </w:p>
     <w:p>
@@ -416,7 +416,7 @@
         <w:pStyle w:val="ListBullet"/>
       </w:pPr>
       <w:r>
-        <w:t>agent runs list / show????? run?summary?tool calls?snapshot ?????</w:t>
+        <w:t>agent runs list / show：查看历史 run、summary、tool calls、snapshot 恢复提示。</w:t>
       </w:r>
     </w:p>
     <w:p>
@@ -424,7 +424,7 @@
         <w:pStyle w:val="Heading2"/>
       </w:pPr>
       <w:r>
-        <w:t>4.2 ????</w:t>
+        <w:t>4.2 工具协议</w:t>
       </w:r>
     </w:p>
     <w:p>
@@ -432,7 +432,7 @@
         <w:pStyle w:val="ListBullet"/>
       </w:pPr>
       <w:r>
-        <w:t>????done?ask_user?</w:t>
+        <w:t>终止类：done、ask_user。</w:t>
       </w:r>
     </w:p>
     <w:p>
@@ -440,7 +440,7 @@
         <w:pStyle w:val="ListBullet"/>
       </w:pPr>
       <w:r>
-        <w:t>????list_dir?read_file?search_files?write_file?apply_patch?</w:t>
+        <w:t>文件类：list_dir、read_file、search_files、write_file、apply_patch。</w:t>
       </w:r>
     </w:p>
     <w:p>
@@ -448,7 +448,7 @@
         <w:pStyle w:val="ListBullet"/>
       </w:pPr>
       <w:r>
-        <w:t>????run_command?????? argv???? shell=true?</w:t>
+        <w:t>命令类：run_command，使用结构化 argv，不支持 shell=true。</w:t>
       </w:r>
     </w:p>
     <w:p>
@@ -456,7 +456,7 @@
         <w:pStyle w:val="ListBullet"/>
       </w:pPr>
       <w:r>
-        <w:t>Git ??git_status?git_diff?</w:t>
+        <w:t>Git 类：git_status、git_diff。</w:t>
       </w:r>
     </w:p>
     <w:p>
@@ -464,7 +464,7 @@
         <w:pStyle w:val="ListBullet"/>
       </w:pPr>
       <w:r>
-        <w:t>????read_pdf????? v0.3 ???????</w:t>
+        <w:t>文档类：read_pdf，目前作为 v0.3 第一个竖切片。</w:t>
       </w:r>
     </w:p>
     <w:p>
@@ -472,7 +472,7 @@
         <w:pStyle w:val="Heading2"/>
       </w:pPr>
       <w:r>
-        <w:t>4.3 Provider?Skills?Memory?Hooks</w:t>
+        <w:t>4.3 Provider、Skills、Memory、Hooks</w:t>
       </w:r>
     </w:p>
     <w:p>
@@ -480,7 +480,7 @@
         <w:pStyle w:val="ListBullet"/>
       </w:pPr>
       <w:r>
-        <w:t>Provider?fake ??? provider?DeepSeek ? OpenAI-compatible ???????</w:t>
+        <w:t>Provider：fake 是默认 provider，DeepSeek 是 OpenAI-compatible 非流式客户端。</w:t>
       </w:r>
     </w:p>
     <w:p>
@@ -488,7 +488,7 @@
         <w:pStyle w:val="ListBullet"/>
       </w:pPr>
       <w:r>
-        <w:t>Skills???????? skill ? discovery/show/load??? progressive disclosure???????????</w:t>
+        <w:t>Skills：支持内置和项目 skill 的 discovery/show/load，采用 progressive disclosure，只在选中后加载正文。</w:t>
       </w:r>
     </w:p>
     <w:p>
@@ -496,7 +496,7 @@
         <w:pStyle w:val="ListBullet"/>
       </w:pPr>
       <w:r>
-        <w:t>Memory?run ???? memory candidate?????????? review?accept?list?undo?</w:t>
+        <w:t>Memory：run 结束生成 memory candidate，不自动写入；用户可 review、accept、list、undo。</w:t>
       </w:r>
     </w:p>
     <w:p>
@@ -504,7 +504,7 @@
         <w:pStyle w:val="ListBullet"/>
       </w:pPr>
       <w:r>
-        <w:t>Hooks???????????? hooks.jsonl?blocking hook ????????? observation?</w:t>
+        <w:t>Hooks：默认关闭；显式启用后写 hooks.jsonl，blocking hook 失败会转成标准错误 observation。</w:t>
       </w:r>
     </w:p>
     <w:p>
@@ -512,7 +512,7 @@
         <w:pStyle w:val="Heading1"/>
       </w:pPr>
       <w:r>
-        <w:t>5. ??????</w:t>
+        <w:t>5. 安全设计亮点</w:t>
       </w:r>
     </w:p>
     <w:p>
@@ -520,7 +520,7 @@
         <w:pStyle w:val="ListBullet"/>
       </w:pPr>
       <w:r>
-        <w:t>??????????? protocol_version?run_id?action_id?created_at ?????Core ?????</w:t>
+        <w:t>模型不可信：模型输出的 protocol_version、run_id、action_id、created_at 不被信任，Core 统一注入。</w:t>
       </w:r>
     </w:p>
     <w:p>
@@ -528,7 +528,7 @@
         <w:pStyle w:val="ListBullet"/>
       </w:pPr>
       <w:r>
-        <w:t>Action schema ??????????? args schema??????????</w:t>
+        <w:t>Action schema 固定：每个工具都有严格 args schema，额外字段会被拒绝。</w:t>
       </w:r>
     </w:p>
     <w:p>
@@ -536,7 +536,7 @@
         <w:pStyle w:val="ListBullet"/>
       </w:pPr>
       <w:r>
-        <w:t>Workspace sandbox????? resolve ?????? ../?symlink/junction escape??? .agent/runs ? .git?</w:t>
+        <w:t>Workspace sandbox：路径通过 resolve 后校验，阻止 ../、symlink/junction escape、写入 .agent/runs 或 .git。</w:t>
       </w:r>
     </w:p>
     <w:p>
@@ -544,7 +544,7 @@
         <w:pStyle w:val="ListBullet"/>
       </w:pPr>
       <w:r>
-        <w:t>?? fail-fast?write_file?apply_patch?run_command ???????????????????</w:t>
+        <w:t>审批 fail-fast：write_file、apply_patch、run_command 默认需要审批；非交互场景不会阻塞等待。</w:t>
       </w:r>
     </w:p>
     <w:p>
@@ -552,7 +552,7 @@
         <w:pStyle w:val="ListBullet"/>
       </w:pPr>
       <w:r>
-        <w:t>Dry-run?????patch?run command ???????????</w:t>
+        <w:t>Dry-run：写文件、patch、run command 会跳过，不产生副作用。</w:t>
       </w:r>
     </w:p>
     <w:p>
@@ -560,7 +560,7 @@
         <w:pStyle w:val="ListBullet"/>
       </w:pPr>
       <w:r>
-        <w:t>Snapshot????????????????summary ?? restore hint?</w:t>
+        <w:t>Snapshot：写入前保存原始文件或缺失状态，summary 提供 restore hint。</w:t>
       </w:r>
     </w:p>
     <w:p>
@@ -568,7 +568,7 @@
         <w:pStyle w:val="ListBullet"/>
       </w:pPr>
       <w:r>
-        <w:t>Redaction???????? token?API key?Authorization ??????</w:t>
+        <w:t>Redaction：日志写入前脱敏 token、API key、Authorization 等敏感内容。</w:t>
       </w:r>
     </w:p>
     <w:p>
@@ -576,7 +576,7 @@
         <w:pStyle w:val="ListBullet"/>
       </w:pPr>
       <w:r>
-        <w:t>Document injection isolation?PDF ?????? UNTRUSTED DOCUMENT SOURCE MATERIAL??????????????????</w:t>
+        <w:t>Document injection isolation：PDF 文本被包装成 UNTRUSTED DOCUMENT SOURCE MATERIAL，只能作为数据，不能覆盖指令或策略。</w:t>
       </w:r>
     </w:p>
     <w:p>
@@ -584,7 +584,7 @@
         <w:pStyle w:val="Heading1"/>
       </w:pPr>
       <w:r>
-        <w:t>6. ???????</w:t>
+        <w:t>6. 测试与质量证据</w:t>
       </w:r>
     </w:p>
     <w:p>
@@ -592,7 +592,7 @@
         <w:pStyle w:val="ListBullet"/>
       </w:pPr>
       <w:r>
-        <w:t>???????213 passed?</w:t>
+        <w:t>当前全量测试：213 passed。</w:t>
       </w:r>
     </w:p>
     <w:p>
@@ -600,7 +600,7 @@
         <w:pStyle w:val="ListBullet"/>
       </w:pPr>
       <w:r>
-        <w:t>?????? action schema?config merge?sandbox?approval?filesystem?shell?git?run_store?redaction?skills?memory?hooks?DeepSeek mock?documents?</w:t>
+        <w:t>覆盖范围包括 action schema、config merge、sandbox、approval、filesystem、shell、git、run_store、redaction、skills、memory、hooks、DeepSeek mock、documents。</w:t>
       </w:r>
     </w:p>
     <w:p>
@@ -608,7 +608,7 @@
         <w:pStyle w:val="ListBullet"/>
       </w:pPr>
       <w:r>
-        <w:t>v0.3 read_pdf ??????action ?????document tool ????????run loop ? read_pdf -&gt; done ???????</w:t>
+        <w:t>v0.3 read_pdf 有三层测试：action 参数校验、document tool 输出不可信材料、run loop 中 read_pdf -&gt; done 的端到端链路。</w:t>
       </w:r>
     </w:p>
     <w:p>
@@ -616,7 +616,7 @@
         <w:pStyle w:val="ListBullet"/>
       </w:pPr>
       <w:r>
-        <w:t>git diff --check ????? Windows CRLF ???</w:t>
+        <w:t>git diff --check 通过，仅有 Windows CRLF 提示。</w:t>
       </w:r>
     </w:p>
     <w:p>
@@ -624,7 +624,7 @@
         <w:pStyle w:val="Heading1"/>
       </w:pPr>
       <w:r>
-        <w:t>7. ??????</w:t>
+        <w:t>7. 面试演示命令</w:t>
       </w:r>
     </w:p>
     <w:p>
@@ -713,29 +713,31 @@
         <w:pStyle w:val="Heading1"/>
       </w:pPr>
       <w:r>
-        <w:t>8. 1 ?????</w:t>
+        <w:t>8. 1 分钟口播稿</w:t>
       </w:r>
     </w:p>
     <w:p>
       <w:r>
         <w:rPr>
+          <w:rFonts w:ascii="Microsoft YaHei" w:hAnsi="Microsoft YaHei" w:eastAsia="Microsoft YaHei"/>
           <w:b/>
         </w:rPr>
-        <w:t>?? A?</w:t>
+        <w:t>版本 A：</w:t>
       </w:r>
       <w:r>
-        <w:t>???????? Python CLI Agent runtime???????? LLM???? Agent ???????????????????????????????? JSON action?Core ???? schema??? action ?????? policy ? sandbox????????shell?git???????v0.1 ?????????? workspace sandbox????????dry-run??????????v0.2 ?? DeepSeek provider???????????? hooks?v0.3 ????????????? read_pdf??????????????????????????????????????? Agent ????????????????????????????????????</w:t>
+        <w:t>我做的是一个本地 Python CLI Agent runtime。它不是简单调用 LLM，而是把 Agent 的运行协议、安全边界和可审计性做成一个小内核。模型只能输出结构化 JSON action，Core 负责校验 schema、注入 action 元数据、检查 policy 和 sandbox，然后调用文件、shell、git、文档等工具。v0.1 先完成安全核心，包括 workspace sandbox、审批失败快退、dry-run、日志、快照和脱敏；v0.2 加了 DeepSeek provider、技能、记忆和默认关闭的 hooks；v0.3 现在开始做文档工具，已经有 read_pdf，而且文档内容会被标记为不可信来源，不能覆盖系统策略。这个项目主要展示的是 Agent 工程里“模型不可信、工具要受控、执行要可审计、错误要可恢复”这一套设计。</w:t>
       </w:r>
     </w:p>
     <w:p>
       <w:r>
         <w:rPr>
+          <w:rFonts w:ascii="Microsoft YaHei" w:hAnsi="Microsoft YaHei" w:eastAsia="Microsoft YaHei"/>
           <w:b/>
         </w:rPr>
-        <w:t>?? B??????</w:t>
+        <w:t>版本 B（更技术）：</w:t>
       </w:r>
       <w:r>
-        <w:t>?? Agent ?????? Action/Observation ???LLM ????????????ActionParser ? Pydantic ??? schema ???Policy ????????????Sandbox ?????? workspace ?????ToolExecutor ??????????????? durable log????????????????? snapshot???????????????????????PDF ?? prompt injection????????????????</w:t>
+        <w:t>这个 Agent 的核心抽象是 Action/Observation 协议。LLM 输出的是请求，不是权限；ActionParser 用 Pydantic 做严格 schema 校验，Policy 决定是否允许或需要审批，Sandbox 做路径解析和 workspace 边界检查，ToolExecutor 才真正执行。所有工具调用会写入 durable log，并且做上下文预算、日志脱敏和写前 snapshot。这样即使模型输出异常、项目文件里有恶意指令、PDF 里有 prompt injection，运行时也不会把它当成可信指令。</w:t>
       </w:r>
     </w:p>
     <w:p>
@@ -743,72 +745,77 @@
         <w:pStyle w:val="Heading1"/>
       </w:pPr>
       <w:r>
-        <w:t>9. ???????</w:t>
+        <w:t>9. 面试官可能追问</w:t>
       </w:r>
     </w:p>
     <w:p>
       <w:r>
         <w:rPr>
+          <w:rFonts w:ascii="Microsoft YaHei" w:hAnsi="Microsoft YaHei" w:eastAsia="Microsoft YaHei"/>
           <w:b/>
         </w:rPr>
-        <w:t>Q?????? LangChain ??????</w:t>
+        <w:t>Q：为什么不用 LangChain 或现成框架？</w:t>
       </w:r>
     </w:p>
     <w:p>
       <w:r>
-        <w:t>A?????????? Agent runtime ??????????????????????????????? demo??????????????</w:t>
+        <w:t>A：这个项目重点是展示 Agent runtime 的底层工程能力：协议、安全、审计、恢复和测试。现成框架能快速搭 demo，但很多安全边界会被抽象掉。</w:t>
       </w:r>
     </w:p>
     <w:p>
       <w:r>
         <w:rPr>
+          <w:rFonts w:ascii="Microsoft YaHei" w:hAnsi="Microsoft YaHei" w:eastAsia="Microsoft YaHei"/>
           <w:b/>
         </w:rPr>
-        <w:t>Q???????????????</w:t>
+        <w:t>Q：为什么模型输出不能直接执行？</w:t>
       </w:r>
     </w:p>
     <w:p>
       <w:r>
-        <w:t>A??????????????????????????????????????????????? schema?policy?sandbox ?????</w:t>
+        <w:t>A：因为模型输出是不可信数据。它可能格式错误、包含额外字段、要求越权路径或危险命令，所以必须经过 schema、policy、sandbox 三层检查。</w:t>
       </w:r>
     </w:p>
     <w:p>
       <w:r>
         <w:rPr>
+          <w:rFonts w:ascii="Microsoft YaHei" w:hAnsi="Microsoft YaHei" w:eastAsia="Microsoft YaHei"/>
           <w:b/>
         </w:rPr>
-        <w:t>Q?run_command ???? argv ??? shell ????</w:t>
+        <w:t>Q：run_command 为什么用 argv 而不是 shell 字符串？</w:t>
       </w:r>
     </w:p>
     <w:p>
       <w:r>
-        <w:t>A?argv ?????????????shell ???????????wrapper ??????v0.1 ??????</w:t>
+        <w:t>A：argv 更容易静态检查和分类风险；shell 字符串有管道、重定向、wrapper 等隐藏行为，v0.1 明确不支持。</w:t>
       </w:r>
     </w:p>
     <w:p>
       <w:r>
         <w:rPr>
+          <w:rFonts w:ascii="Microsoft YaHei" w:hAnsi="Microsoft YaHei" w:eastAsia="Microsoft YaHei"/>
           <w:b/>
         </w:rPr>
-        <w:t>Q???????????</w:t>
+        <w:t>Q：记忆为什么不自动写？</w:t>
       </w:r>
     </w:p>
     <w:p>
       <w:r>
-        <w:t>A??????????????????????????????? candidate??? review/accept ???? active entry?</w:t>
+        <w:t>A：长期记忆会影响后续上下文，自动写容易污染行为。所以默认只生成 candidate，用户 review/accept 后才成为 active entry。</w:t>
       </w:r>
     </w:p>
     <w:p>
       <w:r>
         <w:rPr>
+          <w:rFonts w:ascii="Microsoft YaHei" w:hAnsi="Microsoft YaHei" w:eastAsia="Microsoft YaHei"/>
           <w:b/>
         </w:rPr>
-        <w:t>Q?PDF ????????????</w:t>
+        <w:t>Q：PDF 文档为什么要标记不可信？</w:t>
       </w:r>
     </w:p>
     <w:p>
       <w:r>
-        <w:t>A????????????????? prompt injection?????????????????????????????? schema?</w:t>
+        <w:t>A：文档可能包含“忽略之前指令”这类 prompt injection。系统只把它当来源材料，并加固定头部说明它不能覆盖策略或工具 schema。</w:t>
       </w:r>
     </w:p>
     <w:p>
@@ -816,7 +823,7 @@
         <w:pStyle w:val="Heading1"/>
       </w:pPr>
       <w:r>
-        <w:t>10. ????</w:t>
+        <w:t>10. 后续规划</w:t>
       </w:r>
     </w:p>
     <w:p>
@@ -824,7 +831,7 @@
         <w:pStyle w:val="ListBullet"/>
       </w:pPr>
       <w:r>
-        <w:t>?? v0.3?? read_docx?read_xlsx?read_pptx?</w:t>
+        <w:t>继续 v0.3：补 read_docx、read_xlsx、read_pptx。</w:t>
       </w:r>
     </w:p>
     <w:p>
@@ -832,7 +839,7 @@
         <w:pStyle w:val="ListBullet"/>
       </w:pPr>
       <w:r>
-        <w:t>?? Markdown/Word report generation?? Agent ????????????</w:t>
+        <w:t>增加 Markdown/Word report generation，让 Agent 能基于来源材料生成报告。</w:t>
       </w:r>
     </w:p>
     <w:p>
@@ -840,7 +847,7 @@
         <w:pStyle w:val="ListBullet"/>
       </w:pPr>
       <w:r>
-        <w:t>??????????? fixture??? malicious document text ???????</w:t>
+        <w:t>补更真实的文档注入测试 fixture，验证 malicious document text 只能作为数据。</w:t>
       </w:r>
     </w:p>
     <w:p>
@@ -848,7 +855,7 @@
         <w:pStyle w:val="ListBullet"/>
       </w:pPr>
       <w:r>
-        <w:t>????? embedding-backed memory?shell-command hooks sandbox??? provider?</w:t>
+        <w:t>后续可考虑 embedding-backed memory、shell-command hooks sandbox、更多 provider。</w:t>
       </w:r>
     </w:p>
     <w:p>
@@ -856,7 +863,7 @@
         <w:pStyle w:val="Heading1"/>
       </w:pPr>
       <w:r>
-        <w:t>11. ????????</w:t>
+        <w:t>11. 可引用的代码位置</w:t>
       </w:r>
     </w:p>
     <w:p>
@@ -864,7 +871,7 @@
         <w:pStyle w:val="ListBullet"/>
       </w:pPr>
       <w:r>
-        <w:t>Action schema?src/agent/core/actions.py?</w:t>
+        <w:t>Action schema：src/agent/core/actions.py。</w:t>
       </w:r>
     </w:p>
     <w:p>
@@ -872,7 +879,7 @@
         <w:pStyle w:val="ListBullet"/>
       </w:pPr>
       <w:r>
-        <w:t>Run loop?src/agent/core/loop.py?</w:t>
+        <w:t>Run loop：src/agent/core/loop.py。</w:t>
       </w:r>
     </w:p>
     <w:p>
@@ -880,7 +887,7 @@
         <w:pStyle w:val="ListBullet"/>
       </w:pPr>
       <w:r>
-        <w:t>Config merge?src/agent/config.py?</w:t>
+        <w:t>Config merge：src/agent/config.py。</w:t>
       </w:r>
     </w:p>
     <w:p>
@@ -888,7 +895,7 @@
         <w:pStyle w:val="ListBullet"/>
       </w:pPr>
       <w:r>
-        <w:t>Sandbox?src/agent/policy/sandbox.py?</w:t>
+        <w:t>Sandbox：src/agent/policy/sandbox.py。</w:t>
       </w:r>
     </w:p>
     <w:p>
@@ -896,7 +903,7 @@
         <w:pStyle w:val="ListBullet"/>
       </w:pPr>
       <w:r>
-        <w:t>Approval policy?src/agent/policy/approvals.py?</w:t>
+        <w:t>Approval policy：src/agent/policy/approvals.py。</w:t>
       </w:r>
     </w:p>
     <w:p>
@@ -904,7 +911,7 @@
         <w:pStyle w:val="ListBullet"/>
       </w:pPr>
       <w:r>
-        <w:t>PDF document tool?src/agent/tools/documents.py?</w:t>
+        <w:t>PDF document tool：src/agent/tools/documents.py。</w:t>
       </w:r>
     </w:p>
     <w:p>
@@ -912,7 +919,7 @@
         <w:pStyle w:val="ListBullet"/>
       </w:pPr>
       <w:r>
-        <w:t>v0.3 acceptance?docs/v0.3-acceptance.md?</w:t>
+        <w:t>v0.3 acceptance：docs/v0.3-acceptance.md。</w:t>
       </w:r>
     </w:p>
     <w:sectPr>

</xml_diff>